<commit_message>
Polynomial orders for each curve
</commit_message>
<xml_diff>
--- a/Pump-Master-Pro/pump-app/Manual.docx
+++ b/Pump-Master-Pro/pump-app/Manual.docx
@@ -1,6 +1,6 @@
 
 <file path=word/document.xml><?xml version="1.0" encoding="utf-8"?>
-<w:document xmlns:wpc="http://schemas.microsoft.com/office/word/2010/wordprocessingCanvas" xmlns:cx="http://schemas.microsoft.com/office/drawing/2014/chartex" xmlns:cx1="http://schemas.microsoft.com/office/drawing/2015/9/8/chartex" xmlns:cx2="http://schemas.microsoft.com/office/drawing/2015/10/21/chartex" xmlns:cx3="http://schemas.microsoft.com/office/drawing/2016/5/9/chartex" xmlns:cx4="http://schemas.microsoft.com/office/drawing/2016/5/10/chartex" xmlns:cx5="http://schemas.microsoft.com/office/drawing/2016/5/11/chartex" xmlns:cx6="http://schemas.microsoft.com/office/drawing/2016/5/12/chartex" xmlns:cx7="http://schemas.microsoft.com/office/drawing/2016/5/13/chartex" xmlns:cx8="http://schemas.microsoft.com/office/drawing/2016/5/14/chartex" xmlns:mc="http://schemas.openxmlformats.org/markup-compatibility/2006" xmlns:aink="http://schemas.microsoft.com/office/drawing/2016/ink" xmlns:am3d="http://schemas.microsoft.com/office/drawing/2017/model3d" xmlns:o="urn:schemas-microsoft-com:office:office" xmlns:oel="http://schemas.microsoft.com/office/2019/extlst" xmlns:r="http://schemas.openxmlformats.org/officeDocument/2006/relationships" xmlns:m="http://schemas.openxmlformats.org/officeDocument/2006/math" xmlns:v="urn:schemas-microsoft-com:vml" xmlns:wp14="http://schemas.microsoft.com/office/word/2010/wordprocessingDrawing" xmlns:wp="http://schemas.openxmlformats.org/drawingml/2006/wordprocessingDrawing" xmlns:w10="urn:schemas-microsoft-com:office:word" xmlns:w="http://schemas.openxmlformats.org/wordprocessingml/2006/main" xmlns:w14="http://schemas.microsoft.com/office/word/2010/wordml" xmlns:w15="http://schemas.microsoft.com/office/word/2012/wordml" xmlns:w16cex="http://schemas.microsoft.com/office/word/2018/wordml/cex" xmlns:w16cid="http://schemas.microsoft.com/office/word/2016/wordml/cid" xmlns:w16="http://schemas.microsoft.com/office/word/2018/wordml" xmlns:w16du="http://schemas.microsoft.com/office/word/2023/wordml/word16du" xmlns:w16sdtdh="http://schemas.microsoft.com/office/word/2020/wordml/sdtdatahash" xmlns:w16sdtfl="http://schemas.microsoft.com/office/word/2024/wordml/sdtformatlock" xmlns:w16se="http://schemas.microsoft.com/office/word/2015/wordml/symex" xmlns:wpg="http://schemas.microsoft.com/office/word/2010/wordprocessingGroup" xmlns:wpi="http://schemas.microsoft.com/office/word/2010/wordprocessingInk" xmlns:wne="http://schemas.microsoft.com/office/word/2006/wordml" xmlns:wps="http://schemas.microsoft.com/office/word/2010/wordprocessingShape" mc:Ignorable="w14 w15 w16se w16cid w16 w16cex w16sdtdh w16sdtfl w16du wp14">
+<w:document xmlns:wpc="http://schemas.microsoft.com/office/word/2010/wordprocessingCanvas" xmlns:cx="http://schemas.microsoft.com/office/drawing/2014/chartex" xmlns:cx1="http://schemas.microsoft.com/office/drawing/2015/9/8/chartex" xmlns:cx2="http://schemas.microsoft.com/office/drawing/2015/10/21/chartex" xmlns:cx3="http://schemas.microsoft.com/office/drawing/2016/5/9/chartex" xmlns:cx4="http://schemas.microsoft.com/office/drawing/2016/5/10/chartex" xmlns:cx5="http://schemas.microsoft.com/office/drawing/2016/5/11/chartex" xmlns:cx6="http://schemas.microsoft.com/office/drawing/2016/5/12/chartex" xmlns:cx7="http://schemas.microsoft.com/office/drawing/2016/5/13/chartex" xmlns:cx8="http://schemas.microsoft.com/office/drawing/2016/5/14/chartex" xmlns:mc="http://schemas.openxmlformats.org/markup-compatibility/2006" xmlns:aink="http://schemas.microsoft.com/office/drawing/2016/ink" xmlns:am3d="http://schemas.microsoft.com/office/drawing/2017/model3d" xmlns:o="urn:schemas-microsoft-com:office:office" xmlns:oel="http://schemas.microsoft.com/office/2019/extlst" xmlns:r="http://schemas.openxmlformats.org/officeDocument/2006/relationships" xmlns:m="http://schemas.openxmlformats.org/officeDocument/2006/math" xmlns:v="urn:schemas-microsoft-com:vml" xmlns:wp14="http://schemas.microsoft.com/office/word/2010/wordprocessingDrawing" xmlns:wp="http://schemas.openxmlformats.org/drawingml/2006/wordprocessingDrawing" xmlns:w10="urn:schemas-microsoft-com:office:word" xmlns:w="http://schemas.openxmlformats.org/wordprocessingml/2006/main" xmlns:w14="http://schemas.microsoft.com/office/word/2010/wordml" xmlns:w15="http://schemas.microsoft.com/office/word/2012/wordml" xmlns:w16cei="http://schemas.microsoft.com/office/word/2026/wordml/cei" xmlns:w16cex="http://schemas.microsoft.com/office/word/2018/wordml/cex" xmlns:w16cid="http://schemas.microsoft.com/office/word/2016/wordml/cid" xmlns:w16="http://schemas.microsoft.com/office/word/2018/wordml" xmlns:w16du="http://schemas.microsoft.com/office/word/2023/wordml/word16du" xmlns:w16sdtdh="http://schemas.microsoft.com/office/word/2020/wordml/sdtdatahash" xmlns:w16sdtfl="http://schemas.microsoft.com/office/word/2024/wordml/sdtformatlock" xmlns:w16se="http://schemas.microsoft.com/office/word/2015/wordml/symex" xmlns:wpg="http://schemas.microsoft.com/office/word/2010/wordprocessingGroup" xmlns:wpi="http://schemas.microsoft.com/office/word/2010/wordprocessingInk" xmlns:wne="http://schemas.microsoft.com/office/word/2006/wordml" xmlns:wps="http://schemas.microsoft.com/office/word/2010/wordprocessingShape" mc:Ignorable="w14 w15 w16se w16cid w16 w16cex w16sdtdh w16sdtfl w16du wp14">
   <w:body>
     <w:p>
       <w:r>
@@ -289,6 +289,1132 @@
       <w:proofErr w:type="gramEnd"/>
       <w:r>
         <w:t>N** are populated into the Additional Curves cards.</w:t>
+      </w:r>
+    </w:p>
+    <w:p/>
+    <w:p/>
+    <w:p/>
+    <w:p/>
+    <w:p/>
+    <w:p>
+      <w:r>
+        <w:t># Implementation Plan - Modularizing `app.py` into Flask Blueprints</w:t>
+      </w:r>
+    </w:p>
+    <w:p/>
+    <w:p>
+      <w:r>
+        <w:t>This plan outlines the refactoring of the monolithic `app.py` file into structured Flask Blueprints across dedicated, single-responsibility Python modules.</w:t>
+      </w:r>
+    </w:p>
+    <w:p/>
+    <w:p>
+      <w:r>
+        <w:t>---</w:t>
+      </w:r>
+    </w:p>
+    <w:p/>
+    <w:p>
+      <w:r>
+        <w:t>## Technical Overview &amp; Proposed Architecture</w:t>
+      </w:r>
+    </w:p>
+    <w:p/>
+    <w:p>
+      <w:r>
+        <w:t xml:space="preserve">Currently, `app.py` contains ~705 lines handling DB initialization, PRAGMA migrations, pump CRUD, curve fitting APIs, selection algorithms, comparison endpoints, and form processing. </w:t>
+      </w:r>
+    </w:p>
+    <w:p/>
+    <w:p>
+      <w:r>
+        <w:t>We will refactor this into a clean Blueprint architecture:</w:t>
+      </w:r>
+    </w:p>
+    <w:p/>
+    <w:p>
+      <w:r>
+        <w:t>```</w:t>
+      </w:r>
+    </w:p>
+    <w:p>
+      <w:r>
+        <w:t>pump-app/</w:t>
+      </w:r>
+    </w:p>
+    <w:p>
+      <w:r>
+        <w:rPr>
+          <w:rFonts w:ascii="MS Gothic" w:eastAsia="MS Gothic" w:hAnsi="MS Gothic" w:cs="MS Gothic" w:hint="eastAsia"/>
+        </w:rPr>
+        <w:t>├</w:t>
+      </w:r>
+      <w:r>
+        <w:rPr>
+          <w:rFonts w:ascii="Calibri" w:hAnsi="Calibri" w:cs="Calibri"/>
+        </w:rPr>
+        <w:t>──</w:t>
+      </w:r>
+      <w:r>
+        <w:t xml:space="preserve"> app.py                   # App factory, DB </w:t>
+      </w:r>
+      <w:proofErr w:type="spellStart"/>
+      <w:r>
+        <w:t>init</w:t>
+      </w:r>
+      <w:proofErr w:type="spellEnd"/>
+      <w:r>
+        <w:t>, auto-migration &amp; blueprint registration (~50 lines)</w:t>
+      </w:r>
+    </w:p>
+    <w:p>
+      <w:r>
+        <w:rPr>
+          <w:rFonts w:ascii="MS Gothic" w:eastAsia="MS Gothic" w:hAnsi="MS Gothic" w:cs="MS Gothic" w:hint="eastAsia"/>
+        </w:rPr>
+        <w:t>├</w:t>
+      </w:r>
+      <w:r>
+        <w:rPr>
+          <w:rFonts w:ascii="Calibri" w:hAnsi="Calibri" w:cs="Calibri"/>
+        </w:rPr>
+        <w:t>──</w:t>
+      </w:r>
+      <w:r>
+        <w:t xml:space="preserve"> models.py                # Database models (Pump, </w:t>
+      </w:r>
+      <w:proofErr w:type="spellStart"/>
+      <w:r>
+        <w:t>db</w:t>
+      </w:r>
+      <w:proofErr w:type="spellEnd"/>
+      <w:r>
+        <w:t>)</w:t>
+      </w:r>
+    </w:p>
+    <w:p>
+      <w:r>
+        <w:rPr>
+          <w:rFonts w:ascii="MS Gothic" w:eastAsia="MS Gothic" w:hAnsi="MS Gothic" w:cs="MS Gothic" w:hint="eastAsia"/>
+        </w:rPr>
+        <w:t>├</w:t>
+      </w:r>
+      <w:r>
+        <w:rPr>
+          <w:rFonts w:ascii="Calibri" w:hAnsi="Calibri" w:cs="Calibri"/>
+        </w:rPr>
+        <w:t>──</w:t>
+      </w:r>
+      <w:r>
+        <w:t xml:space="preserve"> utils.py                 # Shared helper functions (_</w:t>
+      </w:r>
+      <w:proofErr w:type="spellStart"/>
+      <w:r>
+        <w:t>get_float</w:t>
+      </w:r>
+      <w:proofErr w:type="spellEnd"/>
+      <w:r>
+        <w:t>, _</w:t>
+      </w:r>
+      <w:proofErr w:type="spellStart"/>
+      <w:r>
+        <w:t>pump_from_form</w:t>
+      </w:r>
+      <w:proofErr w:type="spellEnd"/>
+      <w:r>
+        <w:t>, _</w:t>
+      </w:r>
+      <w:proofErr w:type="spellStart"/>
+      <w:r>
+        <w:t>auto_fit_coeffs</w:t>
+      </w:r>
+      <w:proofErr w:type="spellEnd"/>
+      <w:r>
+        <w:t>)</w:t>
+      </w:r>
+    </w:p>
+    <w:p>
+      <w:r>
+        <w:rPr>
+          <w:rFonts w:ascii="MS Gothic" w:eastAsia="MS Gothic" w:hAnsi="MS Gothic" w:cs="MS Gothic" w:hint="eastAsia"/>
+        </w:rPr>
+        <w:t>├</w:t>
+      </w:r>
+      <w:r>
+        <w:rPr>
+          <w:rFonts w:ascii="Calibri" w:hAnsi="Calibri" w:cs="Calibri"/>
+        </w:rPr>
+        <w:t>──</w:t>
+      </w:r>
+      <w:r>
+        <w:t xml:space="preserve"> pump_curves.py           # Mathematical polynomial calculations</w:t>
+      </w:r>
+    </w:p>
+    <w:p>
+      <w:r>
+        <w:rPr>
+          <w:rFonts w:ascii="MS Gothic" w:eastAsia="MS Gothic" w:hAnsi="MS Gothic" w:cs="MS Gothic" w:hint="eastAsia"/>
+        </w:rPr>
+        <w:t>├</w:t>
+      </w:r>
+      <w:r>
+        <w:rPr>
+          <w:rFonts w:ascii="Calibri" w:hAnsi="Calibri" w:cs="Calibri"/>
+        </w:rPr>
+        <w:t>──</w:t>
+      </w:r>
+      <w:r>
+        <w:t xml:space="preserve"> pump_selection.py        # Selection algorithms</w:t>
+      </w:r>
+    </w:p>
+    <w:p>
+      <w:r>
+        <w:rPr>
+          <w:rFonts w:ascii="MS Gothic" w:eastAsia="MS Gothic" w:hAnsi="MS Gothic" w:cs="MS Gothic" w:hint="eastAsia"/>
+        </w:rPr>
+        <w:t>├</w:t>
+      </w:r>
+      <w:r>
+        <w:rPr>
+          <w:rFonts w:ascii="Calibri" w:hAnsi="Calibri" w:cs="Calibri"/>
+        </w:rPr>
+        <w:t>──</w:t>
+      </w:r>
+      <w:r>
+        <w:t xml:space="preserve"> seed_data.py             # Database seed data</w:t>
+      </w:r>
+    </w:p>
+    <w:p>
+      <w:r>
+        <w:t>└── routes/</w:t>
+      </w:r>
+    </w:p>
+    <w:p>
+      <w:r>
+        <w:lastRenderedPageBreak/>
+        <w:t xml:space="preserve">    </w:t>
+      </w:r>
+      <w:r>
+        <w:rPr>
+          <w:rFonts w:ascii="MS Gothic" w:eastAsia="MS Gothic" w:hAnsi="MS Gothic" w:cs="MS Gothic" w:hint="eastAsia"/>
+        </w:rPr>
+        <w:t>├</w:t>
+      </w:r>
+      <w:r>
+        <w:rPr>
+          <w:rFonts w:ascii="Calibri" w:hAnsi="Calibri" w:cs="Calibri"/>
+        </w:rPr>
+        <w:t>──</w:t>
+      </w:r>
+      <w:r>
+        <w:t xml:space="preserve"> __init__.py          # Blueprint package initializer</w:t>
+      </w:r>
+    </w:p>
+    <w:p>
+      <w:r>
+        <w:t xml:space="preserve">    </w:t>
+      </w:r>
+      <w:r>
+        <w:rPr>
+          <w:rFonts w:ascii="MS Gothic" w:eastAsia="MS Gothic" w:hAnsi="MS Gothic" w:cs="MS Gothic" w:hint="eastAsia"/>
+        </w:rPr>
+        <w:t>├</w:t>
+      </w:r>
+      <w:r>
+        <w:rPr>
+          <w:rFonts w:ascii="Calibri" w:hAnsi="Calibri" w:cs="Calibri"/>
+        </w:rPr>
+        <w:t>──</w:t>
+      </w:r>
+      <w:r>
+        <w:t xml:space="preserve"> main.py              # Main landing page routes (</w:t>
+      </w:r>
+      <w:proofErr w:type="spellStart"/>
+      <w:r>
+        <w:t>main_bp</w:t>
+      </w:r>
+      <w:proofErr w:type="spellEnd"/>
+      <w:r>
+        <w:t>)</w:t>
+      </w:r>
+    </w:p>
+    <w:p>
+      <w:r>
+        <w:t xml:space="preserve">    </w:t>
+      </w:r>
+      <w:r>
+        <w:rPr>
+          <w:rFonts w:ascii="MS Gothic" w:eastAsia="MS Gothic" w:hAnsi="MS Gothic" w:cs="MS Gothic" w:hint="eastAsia"/>
+        </w:rPr>
+        <w:t>├</w:t>
+      </w:r>
+      <w:r>
+        <w:rPr>
+          <w:rFonts w:ascii="Calibri" w:hAnsi="Calibri" w:cs="Calibri"/>
+        </w:rPr>
+        <w:t>──</w:t>
+      </w:r>
+      <w:r>
+        <w:t xml:space="preserve"> pumps.py             # Pump CRUD management (/pump-data, /new, /edit, /delete) (</w:t>
+      </w:r>
+      <w:proofErr w:type="spellStart"/>
+      <w:r>
+        <w:t>pumps_bp</w:t>
+      </w:r>
+      <w:proofErr w:type="spellEnd"/>
+      <w:r>
+        <w:t>)</w:t>
+      </w:r>
+    </w:p>
+    <w:p>
+      <w:r>
+        <w:t xml:space="preserve">    </w:t>
+      </w:r>
+      <w:r>
+        <w:rPr>
+          <w:rFonts w:ascii="MS Gothic" w:eastAsia="MS Gothic" w:hAnsi="MS Gothic" w:cs="MS Gothic" w:hint="eastAsia"/>
+        </w:rPr>
+        <w:t>├</w:t>
+      </w:r>
+      <w:r>
+        <w:rPr>
+          <w:rFonts w:ascii="Calibri" w:hAnsi="Calibri" w:cs="Calibri"/>
+        </w:rPr>
+        <w:t>──</w:t>
+      </w:r>
+      <w:r>
+        <w:t xml:space="preserve"> curves.py            # Curve viewer &amp; chart APIs (/pump-curve, /</w:t>
+      </w:r>
+      <w:proofErr w:type="spellStart"/>
+      <w:r>
+        <w:t>papi</w:t>
+      </w:r>
+      <w:proofErr w:type="spellEnd"/>
+      <w:r>
+        <w:t>/preview-*, etc.) (</w:t>
+      </w:r>
+      <w:proofErr w:type="spellStart"/>
+      <w:r>
+        <w:t>curves_bp</w:t>
+      </w:r>
+      <w:proofErr w:type="spellEnd"/>
+      <w:r>
+        <w:t>)</w:t>
+      </w:r>
+    </w:p>
+    <w:p>
+      <w:r>
+        <w:t xml:space="preserve">    </w:t>
+      </w:r>
+      <w:r>
+        <w:rPr>
+          <w:rFonts w:ascii="MS Gothic" w:eastAsia="MS Gothic" w:hAnsi="MS Gothic" w:cs="MS Gothic" w:hint="eastAsia"/>
+        </w:rPr>
+        <w:t>├</w:t>
+      </w:r>
+      <w:r>
+        <w:rPr>
+          <w:rFonts w:ascii="Calibri" w:hAnsi="Calibri" w:cs="Calibri"/>
+        </w:rPr>
+        <w:t>──</w:t>
+      </w:r>
+      <w:r>
+        <w:t xml:space="preserve"> selection.py         # Pump selection tool (/pump-selection, /</w:t>
+      </w:r>
+      <w:proofErr w:type="spellStart"/>
+      <w:r>
+        <w:t>papi</w:t>
+      </w:r>
+      <w:proofErr w:type="spellEnd"/>
+      <w:r>
+        <w:t>/select-pumps) (</w:t>
+      </w:r>
+      <w:proofErr w:type="spellStart"/>
+      <w:r>
+        <w:t>selection_bp</w:t>
+      </w:r>
+      <w:proofErr w:type="spellEnd"/>
+      <w:r>
+        <w:t>)</w:t>
+      </w:r>
+    </w:p>
+    <w:p>
+      <w:r>
+        <w:t xml:space="preserve">    └── comparison.py        # Pump comparison tool (/pump-comparison, /</w:t>
+      </w:r>
+      <w:proofErr w:type="spellStart"/>
+      <w:r>
+        <w:t>papi</w:t>
+      </w:r>
+      <w:proofErr w:type="spellEnd"/>
+      <w:r>
+        <w:t>/compare-pumps) (</w:t>
+      </w:r>
+      <w:proofErr w:type="spellStart"/>
+      <w:r>
+        <w:t>comparison_bp</w:t>
+      </w:r>
+      <w:proofErr w:type="spellEnd"/>
+      <w:r>
+        <w:t>)</w:t>
+      </w:r>
+    </w:p>
+    <w:p>
+      <w:r>
+        <w:t>```</w:t>
+      </w:r>
+    </w:p>
+    <w:p/>
+    <w:p>
+      <w:r>
+        <w:t>---</w:t>
+      </w:r>
+    </w:p>
+    <w:p/>
+    <w:p>
+      <w:r>
+        <w:t>## Proposed Changes</w:t>
+      </w:r>
+    </w:p>
+    <w:p/>
+    <w:p>
+      <w:r>
+        <w:t>### [Component 1: Shared Utilities]</w:t>
+      </w:r>
+    </w:p>
+    <w:p/>
+    <w:p>
+      <w:r>
+        <w:t>#### [NEW] [</w:t>
+      </w:r>
+      <w:proofErr w:type="gramStart"/>
+      <w:r>
+        <w:t>utils.py](</w:t>
+      </w:r>
+      <w:proofErr w:type="gramEnd"/>
+      <w:r>
+        <w:t>file:///c:/Users/DELL/Documents/admin/Lytrose/repos/Pump-Master-Pro/Pump-Master-Pro/pump-app/utils.py)</w:t>
+      </w:r>
+    </w:p>
+    <w:p>
+      <w:r>
+        <w:t>- Move reusable helper functions out of `app.py` into `utils.py`:</w:t>
+      </w:r>
+    </w:p>
+    <w:p>
+      <w:r>
+        <w:t xml:space="preserve">  - `_</w:t>
+      </w:r>
+      <w:proofErr w:type="spellStart"/>
+      <w:r>
+        <w:t>get_</w:t>
+      </w:r>
+      <w:proofErr w:type="gramStart"/>
+      <w:r>
+        <w:t>float</w:t>
+      </w:r>
+      <w:proofErr w:type="spellEnd"/>
+      <w:r>
+        <w:t>(</w:t>
+      </w:r>
+      <w:proofErr w:type="gramEnd"/>
+      <w:r>
+        <w:t xml:space="preserve">d, key, </w:t>
+      </w:r>
+      <w:proofErr w:type="gramStart"/>
+      <w:r>
+        <w:t>default)`</w:t>
+      </w:r>
+      <w:proofErr w:type="gramEnd"/>
+    </w:p>
+    <w:p>
+      <w:r>
+        <w:t xml:space="preserve">  - `_</w:t>
+      </w:r>
+      <w:proofErr w:type="spellStart"/>
+      <w:r>
+        <w:t>get_nullable_</w:t>
+      </w:r>
+      <w:proofErr w:type="gramStart"/>
+      <w:r>
+        <w:t>float</w:t>
+      </w:r>
+      <w:proofErr w:type="spellEnd"/>
+      <w:r>
+        <w:t>(</w:t>
+      </w:r>
+      <w:proofErr w:type="gramEnd"/>
+      <w:r>
+        <w:t xml:space="preserve">d, </w:t>
+      </w:r>
+      <w:proofErr w:type="gramStart"/>
+      <w:r>
+        <w:t>key)`</w:t>
+      </w:r>
+      <w:proofErr w:type="gramEnd"/>
+    </w:p>
+    <w:p>
+      <w:r>
+        <w:t xml:space="preserve">  - `_</w:t>
+      </w:r>
+      <w:proofErr w:type="spellStart"/>
+      <w:r>
+        <w:t>get_nullable_</w:t>
+      </w:r>
+      <w:proofErr w:type="gramStart"/>
+      <w:r>
+        <w:t>int</w:t>
+      </w:r>
+      <w:proofErr w:type="spellEnd"/>
+      <w:r>
+        <w:t>(</w:t>
+      </w:r>
+      <w:proofErr w:type="gramEnd"/>
+      <w:r>
+        <w:t xml:space="preserve">d, </w:t>
+      </w:r>
+      <w:proofErr w:type="gramStart"/>
+      <w:r>
+        <w:t>key)`</w:t>
+      </w:r>
+      <w:proofErr w:type="gramEnd"/>
+    </w:p>
+    <w:p>
+      <w:r>
+        <w:t xml:space="preserve">  - `_</w:t>
+      </w:r>
+      <w:proofErr w:type="spellStart"/>
+      <w:r>
+        <w:t>auto_fit_</w:t>
+      </w:r>
+      <w:proofErr w:type="gramStart"/>
+      <w:r>
+        <w:t>coeffs</w:t>
+      </w:r>
+      <w:proofErr w:type="spellEnd"/>
+      <w:r>
+        <w:t>(</w:t>
+      </w:r>
+      <w:proofErr w:type="spellStart"/>
+      <w:proofErr w:type="gramEnd"/>
+      <w:r>
+        <w:t>raw_tables_str</w:t>
+      </w:r>
+      <w:proofErr w:type="spellEnd"/>
+      <w:r>
+        <w:t xml:space="preserve">, </w:t>
+      </w:r>
+      <w:proofErr w:type="spellStart"/>
+      <w:r>
+        <w:t>coeffs_str</w:t>
+      </w:r>
+      <w:proofErr w:type="spellEnd"/>
+      <w:r>
+        <w:t xml:space="preserve">, </w:t>
+      </w:r>
+      <w:proofErr w:type="spellStart"/>
+      <w:r>
+        <w:t>units_</w:t>
+      </w:r>
+      <w:proofErr w:type="gramStart"/>
+      <w:r>
+        <w:t>str</w:t>
+      </w:r>
+      <w:proofErr w:type="spellEnd"/>
+      <w:r>
+        <w:t>)`</w:t>
+      </w:r>
+      <w:proofErr w:type="gramEnd"/>
+    </w:p>
+    <w:p>
+      <w:r>
+        <w:t xml:space="preserve">  - `_</w:t>
+      </w:r>
+      <w:proofErr w:type="spellStart"/>
+      <w:r>
+        <w:t>pump_from_</w:t>
+      </w:r>
+      <w:proofErr w:type="gramStart"/>
+      <w:r>
+        <w:t>form</w:t>
+      </w:r>
+      <w:proofErr w:type="spellEnd"/>
+      <w:r>
+        <w:t>(</w:t>
+      </w:r>
+      <w:proofErr w:type="gramEnd"/>
+      <w:r>
+        <w:t>f, pump=</w:t>
+      </w:r>
+      <w:proofErr w:type="gramStart"/>
+      <w:r>
+        <w:t>None)`</w:t>
+      </w:r>
+      <w:proofErr w:type="gramEnd"/>
+    </w:p>
+    <w:p>
+      <w:r>
+        <w:t>- Include beginner-friendly comments explaining utility functions.</w:t>
+      </w:r>
+    </w:p>
+    <w:p/>
+    <w:p>
+      <w:r>
+        <w:t>---</w:t>
+      </w:r>
+    </w:p>
+    <w:p/>
+    <w:p>
+      <w:r>
+        <w:t>### [Component 2: Modular Blueprints]</w:t>
+      </w:r>
+    </w:p>
+    <w:p/>
+    <w:p>
+      <w:r>
+        <w:lastRenderedPageBreak/>
+        <w:t>#### [NEW] [</w:t>
+      </w:r>
+      <w:proofErr w:type="gramStart"/>
+      <w:r>
+        <w:t>routes/__init__.py](</w:t>
+      </w:r>
+      <w:proofErr w:type="gramEnd"/>
+      <w:r>
+        <w:t>file:///c:/Users/DELL/Documents/admin/Lytrose/repos/Pump-Master-Pro/Pump-Master-Pro/pump-app/routes/__init__.py)</w:t>
+      </w:r>
+    </w:p>
+    <w:p>
+      <w:r>
+        <w:t>- Package initialization exposing all blueprints for easy import.</w:t>
+      </w:r>
+    </w:p>
+    <w:p/>
+    <w:p>
+      <w:r>
+        <w:t>#### [NEW] [</w:t>
+      </w:r>
+      <w:proofErr w:type="gramStart"/>
+      <w:r>
+        <w:t>routes/main.py](</w:t>
+      </w:r>
+      <w:proofErr w:type="gramEnd"/>
+      <w:r>
+        <w:t>file:///c:/Users/DELL/Documents/admin/Lytrose/repos/Pump-Master-Pro/Pump-Master-Pro/pump-app/routes/main.py)</w:t>
+      </w:r>
+    </w:p>
+    <w:p>
+      <w:r>
+        <w:t>- Blueprint `</w:t>
+      </w:r>
+      <w:proofErr w:type="spellStart"/>
+      <w:r>
+        <w:t>main_bp</w:t>
+      </w:r>
+      <w:proofErr w:type="spellEnd"/>
+      <w:r>
+        <w:t>` handling index `/` route.</w:t>
+      </w:r>
+    </w:p>
+    <w:p/>
+    <w:p>
+      <w:r>
+        <w:t>#### [NEW] [</w:t>
+      </w:r>
+      <w:proofErr w:type="gramStart"/>
+      <w:r>
+        <w:t>routes/pumps.py](</w:t>
+      </w:r>
+      <w:proofErr w:type="gramEnd"/>
+      <w:r>
+        <w:t>file:///c:/Users/DELL/Documents/admin/Lytrose/repos/Pump-Master-Pro/Pump-Master-Pro/pump-app/routes/pumps.py)</w:t>
+      </w:r>
+    </w:p>
+    <w:p>
+      <w:r>
+        <w:t>- Blueprint `</w:t>
+      </w:r>
+      <w:proofErr w:type="spellStart"/>
+      <w:r>
+        <w:t>pumps_bp</w:t>
+      </w:r>
+      <w:proofErr w:type="spellEnd"/>
+      <w:r>
+        <w:t>` handling pump management:</w:t>
+      </w:r>
+    </w:p>
+    <w:p>
+      <w:r>
+        <w:t xml:space="preserve">  - `GET /pump-data` (Pump inventory list)</w:t>
+      </w:r>
+    </w:p>
+    <w:p>
+      <w:r>
+        <w:t xml:space="preserve">  - `GET &amp; POST /pump-data/new` (Add pump)</w:t>
+      </w:r>
+    </w:p>
+    <w:p>
+      <w:r>
+        <w:t xml:space="preserve">  - `GET &amp; POST /pump-data/edit/&lt;id&gt;` (Edit pump)</w:t>
+      </w:r>
+    </w:p>
+    <w:p>
+      <w:r>
+        <w:t xml:space="preserve">  - `POST /pump-data/delete/&lt;id&gt;` (Delete pump)</w:t>
+      </w:r>
+    </w:p>
+    <w:p/>
+    <w:p>
+      <w:r>
+        <w:t>#### [NEW] [</w:t>
+      </w:r>
+      <w:proofErr w:type="gramStart"/>
+      <w:r>
+        <w:t>routes/curves.py](</w:t>
+      </w:r>
+      <w:proofErr w:type="gramEnd"/>
+      <w:r>
+        <w:t>file:///c:/Users/DELL/Documents/admin/Lytrose/repos/Pump-Master-Pro/Pump-Master-Pro/pump-app/routes/curves.py)</w:t>
+      </w:r>
+    </w:p>
+    <w:p>
+      <w:r>
+        <w:t>- Blueprint `</w:t>
+      </w:r>
+      <w:proofErr w:type="spellStart"/>
+      <w:r>
+        <w:t>curves_bp</w:t>
+      </w:r>
+      <w:proofErr w:type="spellEnd"/>
+      <w:r>
+        <w:t>` handling curve viewing and preview APIs:</w:t>
+      </w:r>
+    </w:p>
+    <w:p>
+      <w:r>
+        <w:t xml:space="preserve">  - `GET /pump-curve/&lt;id&gt;` (Curve viewer page)</w:t>
+      </w:r>
+    </w:p>
+    <w:p>
+      <w:r>
+        <w:t xml:space="preserve">  - `POST /</w:t>
+      </w:r>
+      <w:proofErr w:type="spellStart"/>
+      <w:r>
+        <w:t>papi</w:t>
+      </w:r>
+      <w:proofErr w:type="spellEnd"/>
+      <w:r>
+        <w:t>/fit-curves` (Polynomial fitting API)</w:t>
+      </w:r>
+    </w:p>
+    <w:p>
+      <w:r>
+        <w:t xml:space="preserve">  - `GET /</w:t>
+      </w:r>
+      <w:proofErr w:type="spellStart"/>
+      <w:r>
+        <w:t>papi</w:t>
+      </w:r>
+      <w:proofErr w:type="spellEnd"/>
+      <w:r>
+        <w:t>/curve-data/&lt;id&gt;` (Curve data API)</w:t>
+      </w:r>
+    </w:p>
+    <w:p>
+      <w:r>
+        <w:t xml:space="preserve">  - `GET /</w:t>
+      </w:r>
+      <w:proofErr w:type="spellStart"/>
+      <w:r>
+        <w:t>papi</w:t>
+      </w:r>
+      <w:proofErr w:type="spellEnd"/>
+      <w:r>
+        <w:t>/</w:t>
+      </w:r>
+      <w:proofErr w:type="spellStart"/>
+      <w:r>
+        <w:t>warman</w:t>
+      </w:r>
+      <w:proofErr w:type="spellEnd"/>
+      <w:r>
+        <w:t>-chart/&lt;id&gt;` (Full chart API)</w:t>
+      </w:r>
+    </w:p>
+    <w:p>
+      <w:r>
+        <w:t xml:space="preserve">  - `POST /</w:t>
+      </w:r>
+      <w:proofErr w:type="spellStart"/>
+      <w:r>
+        <w:t>papi</w:t>
+      </w:r>
+      <w:proofErr w:type="spellEnd"/>
+      <w:r>
+        <w:t>/preview-</w:t>
+      </w:r>
+      <w:proofErr w:type="spellStart"/>
+      <w:r>
+        <w:t>warman</w:t>
+      </w:r>
+      <w:proofErr w:type="spellEnd"/>
+      <w:r>
+        <w:t>-chart` (Live preview chart API)</w:t>
+      </w:r>
+    </w:p>
+    <w:p>
+      <w:r>
+        <w:t xml:space="preserve">  - `POST /</w:t>
+      </w:r>
+      <w:proofErr w:type="spellStart"/>
+      <w:r>
+        <w:t>papi</w:t>
+      </w:r>
+      <w:proofErr w:type="spellEnd"/>
+      <w:r>
+        <w:t>/preview-curve-data` (Live preview curve API)</w:t>
+      </w:r>
+    </w:p>
+    <w:p>
+      <w:r>
+        <w:t xml:space="preserve">  - `POST /</w:t>
+      </w:r>
+      <w:proofErr w:type="spellStart"/>
+      <w:r>
+        <w:t>papi</w:t>
+      </w:r>
+      <w:proofErr w:type="spellEnd"/>
+      <w:r>
+        <w:t>/pump/&lt;id&gt;/graph-options` (Save options API)</w:t>
+      </w:r>
+    </w:p>
+    <w:p>
+      <w:r>
+        <w:t xml:space="preserve">  - `POST /</w:t>
+      </w:r>
+      <w:proofErr w:type="spellStart"/>
+      <w:r>
+        <w:t>papi</w:t>
+      </w:r>
+      <w:proofErr w:type="spellEnd"/>
+      <w:r>
+        <w:t>/pump/&lt;id&gt;/label-</w:t>
+      </w:r>
+      <w:proofErr w:type="spellStart"/>
+      <w:r>
+        <w:t>pos`</w:t>
+      </w:r>
+      <w:proofErr w:type="spellEnd"/>
+      <w:r>
+        <w:t xml:space="preserve"> (Save label positions API)</w:t>
+      </w:r>
+    </w:p>
+    <w:p/>
+    <w:p>
+      <w:r>
+        <w:t>#### [NEW] [</w:t>
+      </w:r>
+      <w:proofErr w:type="gramStart"/>
+      <w:r>
+        <w:t>routes/selection.py](</w:t>
+      </w:r>
+      <w:proofErr w:type="gramEnd"/>
+      <w:r>
+        <w:t>file:///c:/Users/DELL/Documents/admin/Lytrose/repos/Pump-Master-Pro/Pump-Master-Pro/pump-app/routes/selection.py)</w:t>
+      </w:r>
+    </w:p>
+    <w:p>
+      <w:r>
+        <w:lastRenderedPageBreak/>
+        <w:t>- Blueprint `</w:t>
+      </w:r>
+      <w:proofErr w:type="spellStart"/>
+      <w:r>
+        <w:t>selection_bp</w:t>
+      </w:r>
+      <w:proofErr w:type="spellEnd"/>
+      <w:r>
+        <w:t>` handling pump selection:</w:t>
+      </w:r>
+    </w:p>
+    <w:p>
+      <w:r>
+        <w:t xml:space="preserve">  - `GET &amp; POST /pump-selection` (Selection UI)</w:t>
+      </w:r>
+    </w:p>
+    <w:p>
+      <w:r>
+        <w:t xml:space="preserve">  - `POST /</w:t>
+      </w:r>
+      <w:proofErr w:type="spellStart"/>
+      <w:r>
+        <w:t>papi</w:t>
+      </w:r>
+      <w:proofErr w:type="spellEnd"/>
+      <w:r>
+        <w:t>/select-pumps` (Selection API)</w:t>
+      </w:r>
+    </w:p>
+    <w:p/>
+    <w:p>
+      <w:r>
+        <w:t>#### [NEW] [</w:t>
+      </w:r>
+      <w:proofErr w:type="gramStart"/>
+      <w:r>
+        <w:t>routes/comparison.py](</w:t>
+      </w:r>
+      <w:proofErr w:type="gramEnd"/>
+      <w:r>
+        <w:t>file:///c:/Users/DELL/Documents/admin/Lytrose/repos/Pump-Master-Pro/Pump-Master-Pro/pump-app/routes/comparison.py)</w:t>
+      </w:r>
+    </w:p>
+    <w:p>
+      <w:r>
+        <w:t>- Blueprint `</w:t>
+      </w:r>
+      <w:proofErr w:type="spellStart"/>
+      <w:r>
+        <w:t>comparison_bp</w:t>
+      </w:r>
+      <w:proofErr w:type="spellEnd"/>
+      <w:r>
+        <w:t>` handling pump comparison:</w:t>
+      </w:r>
+    </w:p>
+    <w:p>
+      <w:r>
+        <w:t xml:space="preserve">  - `GET /pump-comparison` (Comparison UI)</w:t>
+      </w:r>
+    </w:p>
+    <w:p>
+      <w:r>
+        <w:t xml:space="preserve">  - `GET /</w:t>
+      </w:r>
+      <w:proofErr w:type="spellStart"/>
+      <w:r>
+        <w:t>papi</w:t>
+      </w:r>
+      <w:proofErr w:type="spellEnd"/>
+      <w:r>
+        <w:t>/compare-pumps` (Comparison API)</w:t>
+      </w:r>
+    </w:p>
+    <w:p/>
+    <w:p>
+      <w:r>
+        <w:t>---</w:t>
+      </w:r>
+    </w:p>
+    <w:p/>
+    <w:p>
+      <w:r>
+        <w:t>### [Component 3: Main Application Entry Point]</w:t>
+      </w:r>
+    </w:p>
+    <w:p/>
+    <w:p>
+      <w:r>
+        <w:t>#### [MODIFY] [</w:t>
+      </w:r>
+      <w:proofErr w:type="gramStart"/>
+      <w:r>
+        <w:t>app.py](</w:t>
+      </w:r>
+      <w:proofErr w:type="gramEnd"/>
+      <w:r>
+        <w:t>file:///c:/Users/DELL/Documents/admin/Lytrose/repos/Pump-Master-Pro/Pump-Master-Pro/pump-app/app.py)</w:t>
+      </w:r>
+    </w:p>
+    <w:p>
+      <w:r>
+        <w:t>- Streamline `app.py` to:</w:t>
+      </w:r>
+    </w:p>
+    <w:p>
+      <w:r>
+        <w:t xml:space="preserve">  - Initialize Flask application instance</w:t>
+      </w:r>
+    </w:p>
+    <w:p>
+      <w:r>
+        <w:t xml:space="preserve">  - Configure SQLite database &amp; initialize </w:t>
+      </w:r>
+      <w:proofErr w:type="spellStart"/>
+      <w:r>
+        <w:t>SQLAlchemy</w:t>
+      </w:r>
+      <w:proofErr w:type="spellEnd"/>
+      <w:r>
+        <w:t xml:space="preserve"> (`</w:t>
+      </w:r>
+      <w:proofErr w:type="spellStart"/>
+      <w:proofErr w:type="gramStart"/>
+      <w:r>
+        <w:t>db.init</w:t>
+      </w:r>
+      <w:proofErr w:type="gramEnd"/>
+      <w:r>
+        <w:t>_app</w:t>
+      </w:r>
+      <w:proofErr w:type="spellEnd"/>
+      <w:r>
+        <w:t>`)</w:t>
+      </w:r>
+    </w:p>
+    <w:p>
+      <w:r>
+        <w:t xml:space="preserve">  - Run database creation &amp; `PRAGMA </w:t>
+      </w:r>
+      <w:proofErr w:type="spellStart"/>
+      <w:r>
+        <w:t>table_info</w:t>
+      </w:r>
+      <w:proofErr w:type="spellEnd"/>
+      <w:r>
+        <w:t>` auto-migrations</w:t>
+      </w:r>
+    </w:p>
+    <w:p>
+      <w:r>
+        <w:t xml:space="preserve">  - Register all 5 Flask Blueprints (`</w:t>
+      </w:r>
+      <w:proofErr w:type="spellStart"/>
+      <w:r>
+        <w:t>main_bp</w:t>
+      </w:r>
+      <w:proofErr w:type="spellEnd"/>
+      <w:r>
+        <w:t>`, `</w:t>
+      </w:r>
+      <w:proofErr w:type="spellStart"/>
+      <w:r>
+        <w:t>pumps_bp</w:t>
+      </w:r>
+      <w:proofErr w:type="spellEnd"/>
+      <w:r>
+        <w:t>`, `</w:t>
+      </w:r>
+      <w:proofErr w:type="spellStart"/>
+      <w:r>
+        <w:t>curves_bp</w:t>
+      </w:r>
+      <w:proofErr w:type="spellEnd"/>
+      <w:r>
+        <w:t>`, `</w:t>
+      </w:r>
+      <w:proofErr w:type="spellStart"/>
+      <w:r>
+        <w:t>selection_bp</w:t>
+      </w:r>
+      <w:proofErr w:type="spellEnd"/>
+      <w:r>
+        <w:t>`, `</w:t>
+      </w:r>
+      <w:proofErr w:type="spellStart"/>
+      <w:r>
+        <w:t>comparison_bp</w:t>
+      </w:r>
+      <w:proofErr w:type="spellEnd"/>
+      <w:r>
+        <w:t>`)</w:t>
+      </w:r>
+    </w:p>
+    <w:p>
+      <w:r>
+        <w:t xml:space="preserve">  - Start development server when executed directly</w:t>
+      </w:r>
+    </w:p>
+    <w:p/>
+    <w:p>
+      <w:r>
+        <w:t>---</w:t>
+      </w:r>
+    </w:p>
+    <w:p/>
+    <w:p>
+      <w:r>
+        <w:t>## Verification Plan</w:t>
+      </w:r>
+    </w:p>
+    <w:p/>
+    <w:p>
+      <w:r>
+        <w:t>### Automated Verification</w:t>
+      </w:r>
+    </w:p>
+    <w:p>
+      <w:r>
+        <w:t>- Run Python syntax checks on all new blueprint files and modified `app.py`.</w:t>
+      </w:r>
+    </w:p>
+    <w:p>
+      <w:r>
+        <w:lastRenderedPageBreak/>
+        <w:t>- Run automated Flask client integration tests making HTTP requests to every endpoint:</w:t>
+      </w:r>
+    </w:p>
+    <w:p>
+      <w:r>
+        <w:t xml:space="preserve">  - GET `/`</w:t>
+      </w:r>
+    </w:p>
+    <w:p>
+      <w:r>
+        <w:t xml:space="preserve">  - GET `/pump-data`</w:t>
+      </w:r>
+    </w:p>
+    <w:p>
+      <w:r>
+        <w:t xml:space="preserve">  - GET `/pump-selection`</w:t>
+      </w:r>
+    </w:p>
+    <w:p>
+      <w:r>
+        <w:t xml:space="preserve">  - GET `/pump-comparison`</w:t>
+      </w:r>
+    </w:p>
+    <w:p>
+      <w:r>
+        <w:t xml:space="preserve">  - POST `/</w:t>
+      </w:r>
+      <w:proofErr w:type="spellStart"/>
+      <w:r>
+        <w:t>papi</w:t>
+      </w:r>
+      <w:proofErr w:type="spellEnd"/>
+      <w:r>
+        <w:t>/preview-</w:t>
+      </w:r>
+      <w:proofErr w:type="spellStart"/>
+      <w:r>
+        <w:t>warman</w:t>
+      </w:r>
+      <w:proofErr w:type="spellEnd"/>
+      <w:r>
+        <w:t>-chart`</w:t>
+      </w:r>
+    </w:p>
+    <w:p>
+      <w:r>
+        <w:t xml:space="preserve">  - POST `/pump-data/new` and `/pump-data/edit/&lt;id&gt;`</w:t>
+      </w:r>
+    </w:p>
+    <w:p>
+      <w:r>
+        <w:t>- Verify DB auto-migrations and seed functionality.</w:t>
+      </w:r>
+    </w:p>
+    <w:p/>
+    <w:p>
+      <w:r>
+        <w:t>### Manual Verification</w:t>
+      </w:r>
+    </w:p>
+    <w:p>
+      <w:r>
+        <w:t>- Test all application pages in browser to confirm zero broken routes or template links.</w:t>
       </w:r>
     </w:p>
     <w:sectPr>

</xml_diff>